<commit_message>
Humanize Review 2/3 documents; add presentation guide and Q&A
Co-Authored-By: Claude Sonnet 5.5 <noreply@anthropic.com>
Claude-Session: https://claude.ai/code/session_01PxJg5Kdj3DxQWxYBUBsz7B
</commit_message>
<xml_diff>
--- a/submission/Review2_Design_and_Implementation.docx
+++ b/submission/Review2_Design_and_Implementation.docx
@@ -316,7 +316,7 @@
           <w:b w:val="0"/>
           <w:i w:val="0"/>
         </w:rPr>
-        <w:t>At an automated toll booth a vehicle's 96-bit RFID tag ID is read while the vehicle passes at speed. A failed read means a missed charge or a stopped vehicle, and a retransmission costs a round trip the moving vehicle may not have. The wireless channel is noisy (random bit flips from the environment, bursts from trucks or other readers). Instead of asking for a retransmission, the receiver should correct errors in place using forward error correction (FEC), protected end to end by a CRC-32 so a wrong ID is never accepted silently.</w:t>
+        <w:t>Think about a car going through an automated toll booth. The booth has to read a 96-bit RFID tag ID in the short time the car is in range, and the radio link it uses is noisy. Some bits get flipped at random, and now and then a passing truck or another reader wipes out a whole run of bits. If a read fails, the toll is missed or the car has to stop. Asking the car to send the ID again is not a great answer either, because the car may already be gone by the time the request arrives. So the receiver should fix the errors itself, using forward error correction (FEC), and a CRC-32 checksum on top makes sure a wrong ID is never accepted by mistake.</w:t>
       </w:r>
     </w:p>
     <w:p>
@@ -328,7 +328,7 @@
           <w:b w:val="0"/>
           <w:i w:val="0"/>
         </w:rPr>
-        <w:t>This project extends the approved project "Fast-Lane FEC for Automated Toll Booths" into an adaptive multi-error FEC link layer, simulated in software as three UDP processes (vehicle, noisy channel, tollgate). It also covers a second, bursty scenario (hospital imaging: MRI/CT interference) so that the behaviour of each code can be compared on two very different channels.</w:t>
+        <w:t>Our project grows the approved topic "Fast-Lane FEC for Automated Toll Booths" into an adaptive, multi-error FEC link layer. We simulate it in software as three UDP programs: a vehicle, a noisy channel and a tollgate. To see how the codes behave on very different noise, we also added a second scenario, a hospital with MRI and CT equipment, where interference comes in bursts.</w:t>
       </w:r>
     </w:p>
     <w:p>
@@ -344,7 +344,7 @@
         <w:pStyle w:val="ListNumber"/>
       </w:pPr>
       <w:r>
-        <w:t>Implement from scratch (C11, no external libraries) a family of error-correcting codes: Hamming, SECDED, BCH and Reed-Solomon, with a bit interleaver, plus CRC-32 error detection.</w:t>
+        <w:t>Write a family of error-correcting codes ourselves in C11 without external libraries: Hamming, SECDED, BCH and Reed-Solomon, plus a bit interleaver and a CRC-32 for error detection.</w:t>
       </w:r>
     </w:p>
     <w:p>
@@ -352,7 +352,7 @@
         <w:pStyle w:val="ListNumber"/>
       </w:pPr>
       <w:r>
-        <w:t>Model realistic noise: binary symmetric channel (BSC), Gilbert-Elliott bursty channel and burst errors, in two interference profiles.</w:t>
+        <w:t>Model the noise with three models (binary symmetric channel, Gilbert-Elliott and single bursts), packaged into two interference profiles.</w:t>
       </w:r>
     </w:p>
     <w:p>
@@ -360,7 +360,7 @@
         <w:pStyle w:val="ListNumber"/>
       </w:pPr>
       <w:r>
-        <w:t>Build a real three-process UDP pipeline with a feedback path, so the system is a working link and not only a calculation.</w:t>
+        <w:t>Build a real three-process UDP link with a feedback path, so that it behaves like a working system and not only a set of calculations.</w:t>
       </w:r>
     </w:p>
     <w:p>
@@ -368,7 +368,7 @@
         <w:pStyle w:val="ListNumber"/>
       </w:pPr>
       <w:r>
-        <w:t>Compare plain FEC with Stop-and-Wait ARQ, Hybrid ARQ and an adaptive controller that changes code strength from receiver feedback.</w:t>
+        <w:t>Compare plain FEC with Stop-and-Wait ARQ, Hybrid ARQ and an adaptive controller that picks a stronger or weaker code based on what the receiver reports.</w:t>
       </w:r>
     </w:p>
     <w:p>
@@ -376,7 +376,7 @@
         <w:pStyle w:val="ListNumber"/>
       </w:pPr>
       <w:r>
-        <w:t>Measure success rate, silent-wrong rate, goodput, retransmissions and latency in a reproducible, seeded way.</w:t>
+        <w:t>Measure success rate, silent-wrong rate, goodput, retransmissions and latency, using seeded random numbers so anyone can repeat a run and get the same answer.</w:t>
       </w:r>
     </w:p>
     <w:p>
@@ -449,7 +449,7 @@
           <w:b w:val="0"/>
           <w:i w:val="0"/>
         </w:rPr>
-        <w:t>The vehicle encodes ID96 plus CRC-32 with the selected code and sends it on UDP 9000. The channel process injects noise and forwards on UDP 9001, adding an evaluation-only ground-truth sidecar. The tollgate decodes, checks the CRC and classifies each frame; it returns ACK/NAK and sliding-window statistics on UDP 9002. Every program links one shared library, so the in-process benchmark and the real UDP programs run identical code.</w:t>
+        <w:t>The vehicle appends a CRC-32 to the 96-bit ID, encodes the result with the chosen code and sends it on UDP port 9000. The channel program flips bits according to the noise model and passes the frame on to port 9001, together with a small extra field that holds the true ID. That field is only used for scoring and the decoder never reads it. The tollgate decodes the frame, checks the CRC and labels the result, then replies on port 9002 with an ACK or NAK and some recent statistics. All three programs link the same library, which means the benchmark and the real UDP programs run exactly the same code.</w:t>
       </w:r>
     </w:p>
     <w:p>
@@ -802,7 +802,7 @@
           <w:b w:val="0"/>
           <w:i w:val="0"/>
         </w:rPr>
-        <w:t>The 16-byte header (magic, version, type, code, rs_t, interleave, seq, nbits, attempt, strategy) is not corrupted by the channel in this version (a documented design decision, DD-01); the payload is 128 bits before coding.</w:t>
+        <w:t>The 16-byte header holds the magic number, version, type, code, rs_t, interleave depth, sequence number, bit count, attempt number and strategy. In this version the channel leaves the header alone; that was a deliberate decision (DD-01) to keep the first experiments simple. The payload is 128 bits before coding.</w:t>
       </w:r>
     </w:p>
     <w:p>
@@ -1890,7 +1890,7 @@
           <w:b w:val="0"/>
           <w:i w:val="0"/>
         </w:rPr>
-        <w:t>The tollgate reports a sliding window (W = 32 frames) of failures. The vehicle steps the code level up when the failure rate exceeds 0.20, and steps down only when a binomial model predicts that the cheaper code would fail less than 0.05 of the time; a probe back-off avoids flapping. During development the first version evaluated every frame and flapped 14 times; evaluating once per window of evidence removed this (lesson recorded in the design log).</w:t>
+        <w:t>The tollgate keeps a sliding window of the last 32 frames and reports how many failed. If more than 20% failed, the vehicle moves up to a stronger code. Moving down is harder on purpose: it only happens when a binomial model says the cheaper code would fail less than 5% of the time, and a probe back-off stops the controller from bouncing between levels. Our first version checked after every single frame and flipped levels 14 times in one run. Checking once per window fixed that, and we wrote the lesson in the design log.</w:t>
       </w:r>
     </w:p>
     <w:p>
@@ -1909,10 +1909,10 @@
         <w:rPr>
           <w:b/>
         </w:rPr>
-        <w:t xml:space="preserve">CRC-32 (IEEE 802.3) - </w:t>
+        <w:t xml:space="preserve">CRC-32 (IEEE 802.3): </w:t>
       </w:r>
       <w:r>
-        <w:t>remainder of m(x)*x^32 divided by G(x); detects, never corrects; random wrong word passes with probability about 2^-32.</w:t>
+        <w:t>the checksum is the remainder of m(x)*x^32 divided by G(x). It can detect errors but never fix them, and a random wrong word gets through with probability of only about 2^-32.</w:t>
       </w:r>
     </w:p>
     <w:p>
@@ -1923,10 +1923,10 @@
         <w:rPr>
           <w:b/>
         </w:rPr>
-        <w:t xml:space="preserve">Hamming - </w:t>
+        <w:t xml:space="preserve">Hamming: </w:t>
       </w:r>
       <w:r>
-        <w:t>parity-check matrix H with columns 1..n; syndrome of a received word is the binary position of the flipped bit; SECDED adds an overall parity bit to separate single from double errors.</w:t>
+        <w:t>the parity-check matrix H has the numbers 1 to n as its columns, so the syndrome of a received word is simply the position of the flipped bit. SECDED adds one overall parity bit so a single error can be told apart from a double error.</w:t>
       </w:r>
     </w:p>
     <w:p>
@@ -1937,10 +1937,10 @@
         <w:rPr>
           <w:b/>
         </w:rPr>
-        <w:t xml:space="preserve">BCH - </w:t>
+        <w:t xml:space="preserve">BCH: </w:t>
       </w:r>
       <w:r>
-        <w:t>generator g(x) = lcm of minimal polynomials of alpha^1..alpha^2t; decode with syndromes S_j = r(alpha^j), Berlekamp-Massey for the error-locator polynomial and Chien search for the positions.</w:t>
+        <w:t>the generator g(x) is the lcm of the minimal polynomials of alpha^1 to alpha^2t. To decode we compute the syndromes S_j = r(alpha^j), use Berlekamp-Massey to find the error-locator polynomial and then a Chien search to find where the errors are.</w:t>
       </w:r>
     </w:p>
     <w:p>
@@ -1951,10 +1951,10 @@
         <w:rPr>
           <w:b/>
         </w:rPr>
-        <w:t xml:space="preserve">Reed-Solomon over GF(256) - </w:t>
+        <w:t xml:space="preserve">Reed-Solomon over GF(256): </w:t>
       </w:r>
       <w:r>
-        <w:t>same pipeline on byte symbols plus Forney's formula for error values; a burst of up to 8t bits touches few bytes, so RS survives bursts that destroy bit-level codes.</w:t>
+        <w:t>the same steps, but working on whole bytes, plus Forney's formula to get the error values. A burst of up to 8t bits only damages a few bytes, which is why RS survives bursts that wreck bit-level codes.</w:t>
       </w:r>
     </w:p>
     <w:p>
@@ -1965,10 +1965,10 @@
         <w:rPr>
           <w:b/>
         </w:rPr>
-        <w:t xml:space="preserve">Block interleaver - </w:t>
+        <w:t xml:space="preserve">Block interleaver: </w:t>
       </w:r>
       <w:r>
-        <w:t>write row-wise, send column-wise so a burst of L bits becomes about L/d errors per codeword; helps bit codes, hurts RS (measured: RS t=4 on hospital drops from 83.4% to 59.8% with depth 8).</w:t>
+        <w:t>bits are written row by row and sent column by column, so a burst of L bits turns into about L/d errors per codeword. This helps bit-level codes but, surprisingly, hurts RS: on the hospital profile RS t=4 dropped from 83.4% to 59.8% with depth 8.</w:t>
       </w:r>
     </w:p>
     <w:p>
@@ -1979,10 +1979,10 @@
         <w:rPr>
           <w:b/>
         </w:rPr>
-        <w:t xml:space="preserve">Noise - </w:t>
+        <w:t xml:space="preserve">Noise: </w:t>
       </w:r>
       <w:r>
-        <w:t>BSC (independent flips), Gilbert-Elliott (two-state Markov chain, state persists across frames), burst of length L. All randomness uses a seeded RNG, so every run is reproducible.</w:t>
+        <w:t>BSC flips bits independently; Gilbert-Elliott is a two-state Markov chain whose state carries over from frame to frame; the burst model flips a run of L bits. Everything draws from one seeded random number generator, so a run can always be repeated.</w:t>
       </w:r>
     </w:p>
     <w:p>
@@ -1994,7 +1994,7 @@
           <w:b w:val="0"/>
           <w:i/>
         </w:rPr>
-        <w:t>Evaluation method: goodput = correct frames x 128 payload bits / all coded bits on the air (parity and retransmissions included). Latency uses a simulated clock with RTT 20 ms, timeout 100 ms, max 4 retries, 160 kbit/s (assumptions).</w:t>
+        <w:t>How we evaluate: goodput is the number of correct frames times 128 payload bits, divided by every coded bit sent, so parity bits and retransmissions count against it. Latency comes from a simulated clock with an RTT of 20 ms, a timeout of 100 ms, at most 4 retries and a 160 kbit/s link. These values are our assumptions.</w:t>
       </w:r>
     </w:p>
     <w:p>
@@ -2014,7 +2014,7 @@
           <w:b w:val="0"/>
           <w:i w:val="0"/>
         </w:rPr>
-        <w:t>The system has no relational database. Persistent data is file based: per-frame CSV / JSON-lines logs (D1 in the DFD) and benchmark CSVs in results/. The diagrams below show the data flow and the software structure.</w:t>
+        <w:t>The system does not use a relational database. Everything it stores is in files: a per-frame CSV or JSON-lines log (D1 in the data-flow diagram) and the benchmark CSVs in results/. The diagrams below show how data moves through the system and how the software is organised.</w:t>
       </w:r>
     </w:p>
     <w:p>
@@ -2718,7 +2718,7 @@
           <w:b w:val="0"/>
           <w:i w:val="0"/>
         </w:rPr>
-        <w:t>Development was done in phases, tests first: each phase was committed only after `make test` was green.</w:t>
+        <w:t>We worked in phases and wrote the tests first. A phase was only committed once `make test` passed.</w:t>
       </w:r>
     </w:p>
     <w:p>
@@ -2738,7 +2738,7 @@
           <w:b w:val="0"/>
           <w:i w:val="0"/>
         </w:rPr>
-        <w:t>The prototype runs on Linux / WSL / macOS with only a C compiler and make (Python 3 optional for the dashboard and plots):</w:t>
+        <w:t>The prototype runs on Linux, WSL and macOS. All you need is a C compiler and make; Python 3 is only needed for the dashboard and the plots.</w:t>
       </w:r>
     </w:p>
     <w:p>
@@ -2775,7 +2775,7 @@
           <w:b w:val="0"/>
           <w:i w:val="0"/>
         </w:rPr>
-        <w:t>A demo run of 20 frames over the toll profile with Hamming(7,4) produced: 20 CORRECT, 0 DETECTED_FAIL, 0 SILENT_WRONG; the channel flipped 48 of 4,480 bits (measured BER 0.0107 against a model BER 0.0100) and the decoder corrected all 48. The tollgate prints a coloured per-frame bit map showing which bits were flipped and corrected.</w:t>
+        <w:t>In a demo of 20 frames on the toll profile with Hamming(7,4), all 20 frames came out CORRECT, with no DETECTED_FAIL and no SILENT_WRONG. The channel flipped 48 of 4,480 bits (a measured BER of 0.0107 against the model's 0.0100) and the decoder fixed all 48. The tollgate also prints a coloured bit map for each frame that shows which bits were flipped and which were corrected.</w:t>
       </w:r>
     </w:p>
     <w:p>
@@ -3336,7 +3336,7 @@
           <w:b w:val="0"/>
           <w:i w:val="0"/>
         </w:rPr>
-        <w:t>Size at v0.2: 26 library modules, 20 unit-test binaries with 123 test cases, an integration script running real three-process UDP scenarios, 12 plots and 4 benchmark CSV files.</w:t>
+        <w:t>At v0.2 the project has 26 library modules, 20 unit-test programs with 123 test cases, an integration script that runs real three-process UDP scenarios, 12 plots and 4 benchmark CSV files.</w:t>
       </w:r>
     </w:p>
     <w:p>
@@ -3356,7 +3356,7 @@
           <w:b w:val="0"/>
           <w:i w:val="0"/>
         </w:rPr>
-        <w:t>Tests are written before the code they exercise. `make test` builds and runs all of them; all passed at this review.</w:t>
+        <w:t>We wrote each test before the code it checks. `make test` builds and runs all of them, and everything passed at the time of this review.</w:t>
       </w:r>
     </w:p>
     <w:p>
@@ -4258,7 +4258,7 @@
           <w:b w:val="0"/>
           <w:i w:val="0"/>
         </w:rPr>
-        <w:t>Single-seed (seed 42), 5,000 frames per point; GE = Gilbert-Elliott with p_gb = 0.005. Noise parameters are assumptions. Values are frame success rates.</w:t>
+        <w:t>These numbers use a single seed (42) and 5,000 frames per point. GE means Gilbert-Elliott with p_gb = 0.005, and the noise parameters are our own assumptions. Every value is a frame success rate.</w:t>
       </w:r>
     </w:p>
     <w:p>
@@ -5661,7 +5661,7 @@
         <w:pStyle w:val="ListBullet"/>
       </w:pPr>
       <w:r>
-        <w:t>BCH(31,16) is best on random errors (0.9986 at p = 0.01); bursts need Reed-Solomon or an interleaver.</w:t>
+        <w:t>BCH(31,16) does best on random errors (0.9986 at p = 0.01), while bursts need Reed-Solomon or an interleaver.</w:t>
       </w:r>
     </w:p>
     <w:p>
@@ -5669,7 +5669,7 @@
         <w:pStyle w:val="ListBullet"/>
       </w:pPr>
       <w:r>
-        <w:t>SILENT_WRONG = 0 in 1,395,000 frames per profile: the CRC-32 caught every miscorrection.</w:t>
+        <w:t>Out of 1,395,000 frames per profile, none was SILENT_WRONG. The CRC-32 caught every miscorrection.</w:t>
       </w:r>
     </w:p>
     <w:p>
@@ -5677,7 +5677,7 @@
         <w:pStyle w:val="ListBullet"/>
       </w:pPr>
       <w:r>
-        <w:t>Adaptive HARQ cuts retransmissions per frame from 1.78 (ARQ) to 0.076 and p99 latency from 94 ms to 33 ms.</w:t>
+        <w:t>The adaptive scheme brings retransmissions down from 1.78 per frame (plain ARQ) to 0.076, and p99 latency from 94 ms to 33 ms.</w:t>
       </w:r>
     </w:p>
     <w:p>
@@ -5685,7 +5685,7 @@
         <w:pStyle w:val="ListBullet"/>
       </w:pPr>
       <w:r>
-        <w:t>Open question for Review 3: the adaptive controller has not yet been compared with 'always use the strongest code' and with multiple seeds. One seed is an anecdote; this is the first task after this review.</w:t>
+        <w:t>One thing we have not checked yet is whether the adaptive controller really beats simply always using the strongest code, and all of this comes from one seed. That is the first job after this review.</w:t>
       </w:r>
     </w:p>
     <w:p>
@@ -5697,7 +5697,7 @@
           <w:b w:val="0"/>
           <w:i/>
         </w:rPr>
-        <w:t>Limitations of these results: single seed, simulated channel with assumed parameters, no hardware.</w:t>
+        <w:t>Keep in mind that these results come from one seed, a simulated channel with assumed parameters and no hardware.</w:t>
       </w:r>
     </w:p>
     <w:p>
@@ -5717,7 +5717,7 @@
           <w:b w:val="0"/>
           <w:i/>
         </w:rPr>
-        <w:t>Complete before upload. Repository history can be shown from `git log --author`.</w:t>
+        <w:t>To be completed by the team before upload. The repository history (`git log --author`) can back this up.</w:t>
       </w:r>
     </w:p>
     <w:p>
@@ -5954,7 +5954,7 @@
         <w:pStyle w:val="ListBullet"/>
       </w:pPr>
       <w:r>
-        <w:t>Fair baselines: HARQ with fixed RS t=4 and t=8 against the adaptive controller; goodput as the main metric.</w:t>
+        <w:t>Compare the adaptive controller against HARQ with a fixed RS t=4 and RS t=8, using goodput as the main measure.</w:t>
       </w:r>
     </w:p>
     <w:p>
@@ -5962,7 +5962,7 @@
         <w:pStyle w:val="ListBullet"/>
       </w:pPr>
       <w:r>
-        <w:t>Multi-seed statistics (20 seeds) with Student-t 95% confidence intervals and paired differences; RTT sensitivity.</w:t>
+        <w:t>Repeat the experiments over 20 seeds and report 95% confidence intervals and paired differences, plus a test of how RTT changes the result.</w:t>
       </w:r>
     </w:p>
     <w:p>
@@ -5970,7 +5970,7 @@
         <w:pStyle w:val="ListBullet"/>
       </w:pPr>
       <w:r>
-        <w:t>Failure injection (malformed, truncated, duplicate packets, lost END, port in use) and ASan/UBSan builds.</w:t>
+        <w:t>Try to break the system on purpose with malformed, truncated and duplicate packets, a lost END message and a busy port, and run everything under ASan and UBSan.</w:t>
       </w:r>
     </w:p>
     <w:p>
@@ -5978,7 +5978,7 @@
         <w:pStyle w:val="ListBullet"/>
       </w:pPr>
       <w:r>
-        <w:t>Continuous integration, final report, optional LDPC stretch, live demonstration, comparison with the existing approach.</w:t>
+        <w:t>Set up continuous integration, write the final report, attempt LDPC as an extra, and prepare the live demonstration and the comparison with the existing approach.</w:t>
       </w:r>
     </w:p>
     <w:p>

</xml_diff>

<commit_message>
submission: numbered, complete references with in-text citations
Co-Authored-By: Claude Sonnet 5.5 <noreply@anthropic.com>
Claude-Session: https://claude.ai/code/session_015fS3ThmfsSxmYP7DLEhG2y
</commit_message>
<xml_diff>
--- a/submission/Review2_Design_and_Implementation.docx
+++ b/submission/Review2_Design_and_Implementation.docx
@@ -316,7 +316,7 @@
           <w:b w:val="0"/>
           <w:i w:val="0"/>
         </w:rPr>
-        <w:t>Think about a car going through an automated toll booth. The booth has to read a 96-bit RFID tag ID in the short time the car is in range, and the radio link it uses is noisy. Some bits get flipped at random, and now and then a passing truck or another reader wipes out a whole run of bits. If a read fails, the toll is missed or the car has to stop. Asking the car to send the ID again is not a great answer either, because the car may already be gone by the time the request arrives. So the receiver should fix the errors itself, using forward error correction (FEC), and a CRC-32 checksum on top makes sure a wrong ID is never accepted by mistake.</w:t>
+        <w:t>Think about a car going through an automated toll booth. The booth has to read a 96-bit RFID tag ID in the short time the car is in range, and the radio link it uses is noisy. Some bits get flipped at random, and now and then a passing truck or another reader wipes out a whole run of bits. If a read fails, the toll is missed or the car has to stop. Asking the car to send the ID again is not a great answer either, because the car may already be gone by the time the request arrives. So the receiver should fix the errors itself, using forward error correction (FEC), and a CRC-32 checksum [5] on top makes sure a wrong ID is never accepted by mistake.</w:t>
       </w:r>
     </w:p>
     <w:p>
@@ -344,7 +344,7 @@
         <w:pStyle w:val="ListNumber"/>
       </w:pPr>
       <w:r>
-        <w:t>Write a family of error-correcting codes ourselves in C11 without external libraries: Hamming, SECDED, BCH and Reed-Solomon, plus a bit interleaver and a CRC-32 for error detection.</w:t>
+        <w:t>Write a family of error-correcting codes ourselves in C11 without external libraries: Hamming, SECDED, BCH and Reed-Solomon [1], [2], plus a bit interleaver and a CRC-32 for error detection.</w:t>
       </w:r>
     </w:p>
     <w:p>
@@ -352,7 +352,7 @@
         <w:pStyle w:val="ListNumber"/>
       </w:pPr>
       <w:r>
-        <w:t>Model the noise with three models (binary symmetric channel, Gilbert-Elliott and single bursts), packaged into two interference profiles.</w:t>
+        <w:t>Model the noise with three models (binary symmetric channel, Gilbert-Elliott [3], [4] and single bursts), packaged into two interference profiles.</w:t>
       </w:r>
     </w:p>
     <w:p>
@@ -5951,42 +5951,50 @@
     </w:p>
     <w:p>
       <w:pPr>
-        <w:pStyle w:val="ListBullet"/>
+        <w:spacing w:after="60"/>
       </w:pPr>
       <w:r>
-        <w:t>S. Lin and D. J. Costello, Error Control Coding, 2nd ed., Pearson, 2004.</w:t>
+        <w:t>[1] S. Lin and D. J. Costello, Error Control Coding, 2nd ed. Upper Saddle River, NJ: Pearson Prentice Hall, 2004.</w:t>
       </w:r>
     </w:p>
     <w:p>
       <w:pPr>
-        <w:pStyle w:val="ListBullet"/>
+        <w:spacing w:after="60"/>
       </w:pPr>
       <w:r>
-        <w:t>R. E. Blahut, Algebraic Codes for Data Transmission, Cambridge University Press, 2003.</w:t>
+        <w:t>[2] R. E. Blahut, Algebraic Codes for Data Transmission. Cambridge, UK: Cambridge University Press, 2003.</w:t>
       </w:r>
     </w:p>
     <w:p>
       <w:pPr>
-        <w:pStyle w:val="ListBullet"/>
+        <w:spacing w:after="60"/>
       </w:pPr>
       <w:r>
-        <w:t>E. N. Gilbert, 'Capacity of a burst-noise channel', Bell System Technical Journal, 1960; E. O. Elliott, 'Estimates of error rates for codes on burst-noise channels', 1963.</w:t>
+        <w:t>[3] E. N. Gilbert, "Capacity of a burst-noise channel," Bell Syst. Tech. J., vol. 39, no. 5, pp. 1253-1265, Sept. 1960.</w:t>
       </w:r>
     </w:p>
     <w:p>
       <w:pPr>
-        <w:pStyle w:val="ListBullet"/>
+        <w:spacing w:after="60"/>
       </w:pPr>
       <w:r>
-        <w:t>IEEE 802.3 - CRC-32 polynomial.</w:t>
+        <w:t>[4] E. O. Elliott, "Estimates of error rates for codes on burst-noise channels," Bell Syst. Tech. J., vol. 42, no. 5, pp. 1977-1997, Sept. 1963.</w:t>
       </w:r>
     </w:p>
     <w:p>
       <w:pPr>
-        <w:pStyle w:val="ListBullet"/>
+        <w:spacing w:after="60"/>
       </w:pPr>
       <w:r>
-        <w:t>Project repository and design records: docs/DESIGN_DECISIONS.md, docs/ALGORITHMS.md.</w:t>
+        <w:t>[5] IEEE Std 802.3, IEEE Standard for Ethernet (CRC-32 frame check sequence).</w:t>
+      </w:r>
+    </w:p>
+    <w:p>
+      <w:pPr>
+        <w:spacing w:after="60"/>
+      </w:pPr>
+      <w:r>
+        <w:t>Supporting material in the project repository: docs/DESIGN_DECISIONS.md, docs/ALGORITHMS.md.</w:t>
       </w:r>
     </w:p>
     <w:sectPr>

</xml_diff>